<commit_message>
User Guide v1.1: fix project setup flow, 12-phase alignment, dashboard expansion, UI label corrections
</commit_message>
<xml_diff>
--- a/docs/CRM-Builder-User-Guide.docx
+++ b/docs/CRM-Builder-User-Guide.docx
@@ -43,7 +43,7 @@
           <w:sz w:val="22"/>
           <w:szCs w:val="22"/>
         </w:rPr>
-        <w:t xml:space="preserve">Version 1.0</w:t>
+        <w:t xml:space="preserve">Version 1.1</w:t>
       </w:r>
     </w:p>
     <w:p>
@@ -57,7 +57,7 @@
           <w:sz w:val="22"/>
           <w:szCs w:val="22"/>
         </w:rPr>
-        <w:t xml:space="preserve">Last Updated: 04-10-26 12:00</w:t>
+        <w:t xml:space="preserve">Last Updated: 04-10-26 00:58</w:t>
       </w:r>
     </w:p>
     <w:p>
@@ -570,7 +570,7 @@
           <w:sz w:val="22"/>
           <w:szCs w:val="22"/>
         </w:rPr>
-        <w:t xml:space="preserve">CRM Builder is built around an eleven-phase Document Production Process. Each phase has defined inputs, outputs, and completion criteria. Phases must be completed in sequence, as later phases depend on the outputs of earlier ones.</w:t>
+        <w:t xml:space="preserve">CRM Builder is built around a twelve-phase Document Production Process. Each phase has defined inputs, outputs, and completion criteria. Phases must be completed in sequence, as later phases depend on the outputs of earlier ones.</w:t>
       </w:r>
     </w:p>
     <w:p>
@@ -604,7 +604,7 @@
           <w:sz w:val="24"/>
           <w:szCs w:val="24"/>
         </w:rPr>
-        <w:t xml:space="preserve">3.1 The Eleven Phases</w:t>
+        <w:t xml:space="preserve">3.1 The Twelve Phases</w:t>
       </w:r>
     </w:p>
     <w:p>
@@ -737,7 +737,7 @@
               <w:bottom w:val="single" w:color="AAAAAA" w:sz="4"/>
               <w:right w:val="single" w:color="AAAAAA" w:sz="4"/>
             </w:tcBorders>
-            <w:shd w:fill="FFFFFF" w:val="clear"/>
+            <w:shd w:fill="F2F7FB" w:val="clear"/>
             <w:tcMar>
               <w:top w:type="dxa" w:w="80"/>
               <w:left w:type="dxa" w:w="120"/>
@@ -767,7 +767,7 @@
               <w:bottom w:val="single" w:color="AAAAAA" w:sz="4"/>
               <w:right w:val="single" w:color="AAAAAA" w:sz="4"/>
             </w:tcBorders>
-            <w:shd w:fill="FFFFFF" w:val="clear"/>
+            <w:shd w:fill="F2F7FB" w:val="clear"/>
             <w:tcMar>
               <w:top w:type="dxa" w:w="80"/>
               <w:left w:type="dxa" w:w="120"/>
@@ -797,7 +797,7 @@
               <w:bottom w:val="single" w:color="AAAAAA" w:sz="4"/>
               <w:right w:val="single" w:color="AAAAAA" w:sz="4"/>
             </w:tcBorders>
-            <w:shd w:fill="FFFFFF" w:val="clear"/>
+            <w:shd w:fill="F2F7FB" w:val="clear"/>
             <w:tcMar>
               <w:top w:type="dxa" w:w="80"/>
               <w:left w:type="dxa" w:w="120"/>
@@ -921,7 +921,7 @@
               <w:bottom w:val="single" w:color="AAAAAA" w:sz="4"/>
               <w:right w:val="single" w:color="AAAAAA" w:sz="4"/>
             </w:tcBorders>
-            <w:shd w:fill="FFFFFF" w:val="clear"/>
+            <w:shd w:fill="F2F7FB" w:val="clear"/>
             <w:tcMar>
               <w:top w:type="dxa" w:w="80"/>
               <w:left w:type="dxa" w:w="120"/>
@@ -951,7 +951,7 @@
               <w:bottom w:val="single" w:color="AAAAAA" w:sz="4"/>
               <w:right w:val="single" w:color="AAAAAA" w:sz="4"/>
             </w:tcBorders>
-            <w:shd w:fill="FFFFFF" w:val="clear"/>
+            <w:shd w:fill="F2F7FB" w:val="clear"/>
             <w:tcMar>
               <w:top w:type="dxa" w:w="80"/>
               <w:left w:type="dxa" w:w="120"/>
@@ -981,7 +981,7 @@
               <w:bottom w:val="single" w:color="AAAAAA" w:sz="4"/>
               <w:right w:val="single" w:color="AAAAAA" w:sz="4"/>
             </w:tcBorders>
-            <w:shd w:fill="FFFFFF" w:val="clear"/>
+            <w:shd w:fill="F2F7FB" w:val="clear"/>
             <w:tcMar>
               <w:top w:type="dxa" w:w="80"/>
               <w:left w:type="dxa" w:w="120"/>
@@ -1060,7 +1060,7 @@
                 <w:sz w:val="20"/>
                 <w:szCs w:val="20"/>
               </w:rPr>
-              <w:t xml:space="preserve">Process Definition</w:t>
+              <w:t xml:space="preserve">Cross-Domain Service Definition</w:t>
             </w:r>
           </w:p>
         </w:tc>
@@ -1090,7 +1090,7 @@
                 <w:sz w:val="20"/>
                 <w:szCs w:val="20"/>
               </w:rPr>
-              <w:t xml:space="preserve">Each business process is documented in dependency order, one conversation per process, producing one Word document each.</w:t>
+              <w:t xml:space="preserve">Shared capabilities consumed by multiple domains (Notes, Email, Calendar, Surveys) are defined as cross-domain services.</w:t>
             </w:r>
           </w:p>
         </w:tc>
@@ -1105,7 +1105,7 @@
               <w:bottom w:val="single" w:color="AAAAAA" w:sz="4"/>
               <w:right w:val="single" w:color="AAAAAA" w:sz="4"/>
             </w:tcBorders>
-            <w:shd w:fill="FFFFFF" w:val="clear"/>
+            <w:shd w:fill="F2F7FB" w:val="clear"/>
             <w:tcMar>
               <w:top w:type="dxa" w:w="80"/>
               <w:left w:type="dxa" w:w="120"/>
@@ -1135,7 +1135,7 @@
               <w:bottom w:val="single" w:color="AAAAAA" w:sz="4"/>
               <w:right w:val="single" w:color="AAAAAA" w:sz="4"/>
             </w:tcBorders>
-            <w:shd w:fill="FFFFFF" w:val="clear"/>
+            <w:shd w:fill="F2F7FB" w:val="clear"/>
             <w:tcMar>
               <w:top w:type="dxa" w:w="80"/>
               <w:left w:type="dxa" w:w="120"/>
@@ -1152,7 +1152,7 @@
                 <w:sz w:val="20"/>
                 <w:szCs w:val="20"/>
               </w:rPr>
-              <w:t xml:space="preserve">Domain Reconciliation</w:t>
+              <w:t xml:space="preserve">Process Definition</w:t>
             </w:r>
           </w:p>
         </w:tc>
@@ -1165,7 +1165,7 @@
               <w:bottom w:val="single" w:color="AAAAAA" w:sz="4"/>
               <w:right w:val="single" w:color="AAAAAA" w:sz="4"/>
             </w:tcBorders>
-            <w:shd w:fill="FFFFFF" w:val="clear"/>
+            <w:shd w:fill="F2F7FB" w:val="clear"/>
             <w:tcMar>
               <w:top w:type="dxa" w:w="80"/>
               <w:left w:type="dxa" w:w="120"/>
@@ -1182,7 +1182,7 @@
                 <w:sz w:val="20"/>
                 <w:szCs w:val="20"/>
               </w:rPr>
-              <w:t xml:space="preserve">Process documents within a domain are synthesized into a unified Domain PRD, resolving conflicts and gaps.</w:t>
+              <w:t xml:space="preserve">Each business process is documented in dependency order, one conversation per process, producing one Word document each.</w:t>
             </w:r>
           </w:p>
         </w:tc>
@@ -1244,7 +1244,7 @@
                 <w:sz w:val="20"/>
                 <w:szCs w:val="20"/>
               </w:rPr>
-              <w:t xml:space="preserve">Stakeholder Review</w:t>
+              <w:t xml:space="preserve">Domain Reconciliation</w:t>
             </w:r>
           </w:p>
         </w:tc>
@@ -1274,7 +1274,7 @@
                 <w:sz w:val="20"/>
                 <w:szCs w:val="20"/>
               </w:rPr>
-              <w:t xml:space="preserve">Completed domain documents are reviewed by stakeholders outside the tool. Feedback is incorporated before proceeding.</w:t>
+              <w:t xml:space="preserve">Process documents within a domain are synthesized into a unified Domain PRD, resolving conflicts and gaps.</w:t>
             </w:r>
           </w:p>
         </w:tc>
@@ -1289,7 +1289,7 @@
               <w:bottom w:val="single" w:color="AAAAAA" w:sz="4"/>
               <w:right w:val="single" w:color="AAAAAA" w:sz="4"/>
             </w:tcBorders>
-            <w:shd w:fill="FFFFFF" w:val="clear"/>
+            <w:shd w:fill="F2F7FB" w:val="clear"/>
             <w:tcMar>
               <w:top w:type="dxa" w:w="80"/>
               <w:left w:type="dxa" w:w="120"/>
@@ -1319,7 +1319,7 @@
               <w:bottom w:val="single" w:color="AAAAAA" w:sz="4"/>
               <w:right w:val="single" w:color="AAAAAA" w:sz="4"/>
             </w:tcBorders>
-            <w:shd w:fill="FFFFFF" w:val="clear"/>
+            <w:shd w:fill="F2F7FB" w:val="clear"/>
             <w:tcMar>
               <w:top w:type="dxa" w:w="80"/>
               <w:left w:type="dxa" w:w="120"/>
@@ -1336,7 +1336,7 @@
                 <w:sz w:val="20"/>
                 <w:szCs w:val="20"/>
               </w:rPr>
-              <w:t xml:space="preserve">YAML Generation</w:t>
+              <w:t xml:space="preserve">Stakeholder Review</w:t>
             </w:r>
           </w:p>
         </w:tc>
@@ -1349,7 +1349,7 @@
               <w:bottom w:val="single" w:color="AAAAAA" w:sz="4"/>
               <w:right w:val="single" w:color="AAAAAA" w:sz="4"/>
             </w:tcBorders>
-            <w:shd w:fill="FFFFFF" w:val="clear"/>
+            <w:shd w:fill="F2F7FB" w:val="clear"/>
             <w:tcMar>
               <w:top w:type="dxa" w:w="80"/>
               <w:left w:type="dxa" w:w="120"/>
@@ -1366,7 +1366,7 @@
                 <w:sz w:val="20"/>
                 <w:szCs w:val="20"/>
               </w:rPr>
-              <w:t xml:space="preserve">Domain PRDs are translated into structured YAML configuration files that define the CRM system declaratively.</w:t>
+              <w:t xml:space="preserve">Completed domain documents are reviewed by stakeholders outside the tool. Feedback is incorporated before proceeding.</w:t>
             </w:r>
           </w:p>
         </w:tc>
@@ -1428,7 +1428,7 @@
                 <w:sz w:val="20"/>
                 <w:szCs w:val="20"/>
               </w:rPr>
-              <w:t xml:space="preserve">CRM Selection</w:t>
+              <w:t xml:space="preserve">YAML Generation</w:t>
             </w:r>
           </w:p>
         </w:tc>
@@ -1458,7 +1458,7 @@
                 <w:sz w:val="20"/>
                 <w:szCs w:val="20"/>
               </w:rPr>
-              <w:t xml:space="preserve">A CRM platform is evaluated and selected based on requirements documented in the Master PRD.</w:t>
+              <w:t xml:space="preserve">Domain PRDs are translated into structured YAML configuration files that define the CRM system declaratively.</w:t>
             </w:r>
           </w:p>
         </w:tc>
@@ -1473,7 +1473,7 @@
               <w:bottom w:val="single" w:color="AAAAAA" w:sz="4"/>
               <w:right w:val="single" w:color="AAAAAA" w:sz="4"/>
             </w:tcBorders>
-            <w:shd w:fill="FFFFFF" w:val="clear"/>
+            <w:shd w:fill="F2F7FB" w:val="clear"/>
             <w:tcMar>
               <w:top w:type="dxa" w:w="80"/>
               <w:left w:type="dxa" w:w="120"/>
@@ -1503,7 +1503,7 @@
               <w:bottom w:val="single" w:color="AAAAAA" w:sz="4"/>
               <w:right w:val="single" w:color="AAAAAA" w:sz="4"/>
             </w:tcBorders>
-            <w:shd w:fill="FFFFFF" w:val="clear"/>
+            <w:shd w:fill="F2F7FB" w:val="clear"/>
             <w:tcMar>
               <w:top w:type="dxa" w:w="80"/>
               <w:left w:type="dxa" w:w="120"/>
@@ -1520,7 +1520,7 @@
                 <w:sz w:val="20"/>
                 <w:szCs w:val="20"/>
               </w:rPr>
-              <w:t xml:space="preserve">CRM Deployment</w:t>
+              <w:t xml:space="preserve">CRM Selection</w:t>
             </w:r>
           </w:p>
         </w:tc>
@@ -1533,7 +1533,7 @@
               <w:bottom w:val="single" w:color="AAAAAA" w:sz="4"/>
               <w:right w:val="single" w:color="AAAAAA" w:sz="4"/>
             </w:tcBorders>
-            <w:shd w:fill="FFFFFF" w:val="clear"/>
+            <w:shd w:fill="F2F7FB" w:val="clear"/>
             <w:tcMar>
               <w:top w:type="dxa" w:w="80"/>
               <w:left w:type="dxa" w:w="120"/>
@@ -1550,7 +1550,7 @@
                 <w:sz w:val="20"/>
                 <w:szCs w:val="20"/>
               </w:rPr>
-              <w:t xml:space="preserve">The selected CRM platform is provisioned and initialized in the target environment.</w:t>
+              <w:t xml:space="preserve">A CRM platform is evaluated and selected based on requirements documented in the Master PRD.</w:t>
             </w:r>
           </w:p>
         </w:tc>
@@ -1612,7 +1612,7 @@
                 <w:sz w:val="20"/>
                 <w:szCs w:val="20"/>
               </w:rPr>
-              <w:t xml:space="preserve">CRM Configuration</w:t>
+              <w:t xml:space="preserve">CRM Deployment</w:t>
             </w:r>
           </w:p>
         </w:tc>
@@ -1642,7 +1642,7 @@
                 <w:sz w:val="20"/>
                 <w:szCs w:val="20"/>
               </w:rPr>
-              <w:t xml:space="preserve">YAML files are applied to the live CRM instance via the CRM Builder application, configuring fields, layouts, and relationships.</w:t>
+              <w:t xml:space="preserve">The selected CRM platform is provisioned and initialized in the target environment.</w:t>
             </w:r>
           </w:p>
         </w:tc>
@@ -1657,7 +1657,7 @@
               <w:bottom w:val="single" w:color="AAAAAA" w:sz="4"/>
               <w:right w:val="single" w:color="AAAAAA" w:sz="4"/>
             </w:tcBorders>
-            <w:shd w:fill="FFFFFF" w:val="clear"/>
+            <w:shd w:fill="F2F7FB" w:val="clear"/>
             <w:tcMar>
               <w:top w:type="dxa" w:w="80"/>
               <w:left w:type="dxa" w:w="120"/>
@@ -1687,7 +1687,7 @@
               <w:bottom w:val="single" w:color="AAAAAA" w:sz="4"/>
               <w:right w:val="single" w:color="AAAAAA" w:sz="4"/>
             </w:tcBorders>
-            <w:shd w:fill="FFFFFF" w:val="clear"/>
+            <w:shd w:fill="F2F7FB" w:val="clear"/>
             <w:tcMar>
               <w:top w:type="dxa" w:w="80"/>
               <w:left w:type="dxa" w:w="120"/>
@@ -1704,6 +1704,98 @@
                 <w:sz w:val="20"/>
                 <w:szCs w:val="20"/>
               </w:rPr>
+              <w:t xml:space="preserve">CRM Configuration</w:t>
+            </w:r>
+          </w:p>
+        </w:tc>
+        <w:tc>
+          <w:tcPr>
+            <w:tcW w:type="dxa" w:w="5960"/>
+            <w:tcBorders>
+              <w:top w:val="single" w:color="AAAAAA" w:sz="4"/>
+              <w:left w:val="single" w:color="AAAAAA" w:sz="4"/>
+              <w:bottom w:val="single" w:color="AAAAAA" w:sz="4"/>
+              <w:right w:val="single" w:color="AAAAAA" w:sz="4"/>
+            </w:tcBorders>
+            <w:shd w:fill="F2F7FB" w:val="clear"/>
+            <w:tcMar>
+              <w:top w:type="dxa" w:w="80"/>
+              <w:left w:type="dxa" w:w="120"/>
+              <w:bottom w:type="dxa" w:w="80"/>
+              <w:right w:type="dxa" w:w="120"/>
+            </w:tcMar>
+          </w:tcPr>
+          <w:p>
+            <w:r>
+              <w:rPr>
+                <w:rFonts w:ascii="Arial" w:cs="Arial" w:eastAsia="Arial" w:hAnsi="Arial"/>
+                <w:b w:val="false"/>
+                <w:bCs w:val="false"/>
+                <w:sz w:val="20"/>
+                <w:szCs w:val="20"/>
+              </w:rPr>
+              <w:t xml:space="preserve">YAML files are applied to the live CRM instance via the CRM Builder application, configuring fields, layouts, and relationships.</w:t>
+            </w:r>
+          </w:p>
+        </w:tc>
+      </w:tr>
+      <w:tr>
+        <w:tc>
+          <w:tcPr>
+            <w:tcW w:type="dxa" w:w="900"/>
+            <w:tcBorders>
+              <w:top w:val="single" w:color="AAAAAA" w:sz="4"/>
+              <w:left w:val="single" w:color="AAAAAA" w:sz="4"/>
+              <w:bottom w:val="single" w:color="AAAAAA" w:sz="4"/>
+              <w:right w:val="single" w:color="AAAAAA" w:sz="4"/>
+            </w:tcBorders>
+            <w:shd w:fill="F2F7FB" w:val="clear"/>
+            <w:tcMar>
+              <w:top w:type="dxa" w:w="80"/>
+              <w:left w:type="dxa" w:w="120"/>
+              <w:bottom w:type="dxa" w:w="80"/>
+              <w:right w:type="dxa" w:w="120"/>
+            </w:tcMar>
+          </w:tcPr>
+          <w:p>
+            <w:r>
+              <w:rPr>
+                <w:rFonts w:ascii="Arial" w:cs="Arial" w:eastAsia="Arial" w:hAnsi="Arial"/>
+                <w:b w:val="false"/>
+                <w:bCs w:val="false"/>
+                <w:sz w:val="20"/>
+                <w:szCs w:val="20"/>
+              </w:rPr>
+              <w:t xml:space="preserve">12</w:t>
+            </w:r>
+          </w:p>
+        </w:tc>
+        <w:tc>
+          <w:tcPr>
+            <w:tcW w:type="dxa" w:w="2500"/>
+            <w:tcBorders>
+              <w:top w:val="single" w:color="AAAAAA" w:sz="4"/>
+              <w:left w:val="single" w:color="AAAAAA" w:sz="4"/>
+              <w:bottom w:val="single" w:color="AAAAAA" w:sz="4"/>
+              <w:right w:val="single" w:color="AAAAAA" w:sz="4"/>
+            </w:tcBorders>
+            <w:shd w:fill="F2F7FB" w:val="clear"/>
+            <w:tcMar>
+              <w:top w:type="dxa" w:w="80"/>
+              <w:left w:type="dxa" w:w="120"/>
+              <w:bottom w:type="dxa" w:w="80"/>
+              <w:right w:type="dxa" w:w="120"/>
+            </w:tcMar>
+          </w:tcPr>
+          <w:p>
+            <w:r>
+              <w:rPr>
+                <w:rFonts w:ascii="Arial" w:cs="Arial" w:eastAsia="Arial" w:hAnsi="Arial"/>
+                <w:b/>
+                <w:bCs/>
+                <w:sz w:val="20"/>
+                <w:szCs w:val="20"/>
+              </w:rPr>
               <w:t xml:space="preserve">Verification</w:t>
             </w:r>
           </w:p>
@@ -1717,7 +1809,7 @@
               <w:bottom w:val="single" w:color="AAAAAA" w:sz="4"/>
               <w:right w:val="single" w:color="AAAAAA" w:sz="4"/>
             </w:tcBorders>
-            <w:shd w:fill="FFFFFF" w:val="clear"/>
+            <w:shd w:fill="F2F7FB" w:val="clear"/>
             <w:tcMar>
               <w:top w:type="dxa" w:w="80"/>
               <w:left w:type="dxa" w:w="120"/>
@@ -1800,7 +1892,7 @@
           <w:sz w:val="22"/>
           <w:szCs w:val="22"/>
         </w:rPr>
-        <w:t xml:space="preserve">All data entities must be fully defined in Phase 2 before any process documentation begins in Phase 4. This ensures that process documents reference pre-defined entities rather than introducing new ones implicitly.</w:t>
+        <w:t xml:space="preserve">All data entities must be fully defined in Phase 2 before any process documentation begins in Phase 5. This ensures that process documents reference pre-defined entities rather than introducing new ones implicitly.</w:t>
       </w:r>
     </w:p>
     <w:p>
@@ -1950,7 +2042,7 @@
           <w:sz w:val="22"/>
           <w:szCs w:val="22"/>
         </w:rPr>
-        <w:t xml:space="preserve">The CRM Builder application provides the workflow engine, prompt generation, import processing, and configuration management tools for an implementation. This section walks through the application workflow from project setup through configuration.</w:t>
+        <w:t xml:space="preserve">The CRM Builder application provides the Requirements Dashboard, prompt generation, import processing, impact analysis, document generation, and configuration management tools for an implementation. This section walks through the application workflow from project setup through configuration.</w:t>
       </w:r>
     </w:p>
     <w:p>
@@ -2176,7 +2268,7 @@
                 <w:sz w:val="20"/>
                 <w:szCs w:val="20"/>
               </w:rPr>
-              <w:t xml:space="preserve">Set up a new implementation project in the application, linking it to the client repository and naming the instance.</w:t>
+              <w:t xml:space="preserve">Create a new client in the application, linking it to the client repository folder on the local filesystem.</w:t>
             </w:r>
           </w:p>
         </w:tc>
@@ -2238,7 +2330,7 @@
                 <w:sz w:val="20"/>
                 <w:szCs w:val="20"/>
               </w:rPr>
-              <w:t xml:space="preserve">Navigate the Workflow</w:t>
+              <w:t xml:space="preserve">Navigate the Dashboard</w:t>
             </w:r>
           </w:p>
         </w:tc>
@@ -2268,7 +2360,7 @@
                 <w:sz w:val="20"/>
                 <w:szCs w:val="20"/>
               </w:rPr>
-              <w:t xml:space="preserve">The Workflow Engine tracks progress through all eleven phases and surfaces the current step and required inputs.</w:t>
+              <w:t xml:space="preserve">The Requirements Dashboard tracks progress through all twelve phases and surfaces the current step and required inputs.</w:t>
             </w:r>
           </w:p>
         </w:tc>
@@ -2765,7 +2857,7 @@
           <w:sz w:val="22"/>
           <w:szCs w:val="22"/>
         </w:rPr>
-        <w:t xml:space="preserve">Before beginning an implementation, create a new project in the application. A project links an instance (server credentials and URL) to a client repository folder on your local machine.</w:t>
+        <w:t xml:space="preserve">Before beginning an implementation, create a new client in the application. A client record establishes the organizational context for the implementation and links it to a repository folder on your local machine. No CRM instance is needed at this stage — that comes later during deployment.</w:t>
       </w:r>
     </w:p>
     <w:p>
@@ -2796,7 +2888,7 @@
           <w:sz w:val="22"/>
           <w:szCs w:val="22"/>
         </w:rPr>
-        <w:t xml:space="preserve">Open CRM Builder and select the Instances panel.</w:t>
+        <w:t xml:space="preserve">Open CRM Builder in Requirements mode.</w:t>
       </w:r>
     </w:p>
     <w:p>
@@ -2814,7 +2906,7 @@
           <w:sz w:val="22"/>
           <w:szCs w:val="22"/>
         </w:rPr>
-        <w:t xml:space="preserve">Click Add Instance and provide the instance name, URL, and credentials.</w:t>
+        <w:t xml:space="preserve">Click Create Client and provide the client name.</w:t>
       </w:r>
     </w:p>
     <w:p>
@@ -2850,7 +2942,25 @@
           <w:sz w:val="22"/>
           <w:szCs w:val="22"/>
         </w:rPr>
-        <w:t xml:space="preserve">Save the instance. The application will verify connectivity.</w:t>
+        <w:t xml:space="preserve">Save the client. The application initializes the project database and creates the standard folder structure (PRDs/, programs/, reports/, Implementation Docs/).</w:t>
+      </w:r>
+    </w:p>
+    <w:p>
+      <w:pPr>
+        <w:pStyle w:val="ListParagraph"/>
+        <w:numPr>
+          <w:ilvl w:val="0"/>
+          <w:numId w:val="3"/>
+        </w:numPr>
+        <w:spacing w:after="80"/>
+      </w:pPr>
+      <w:r>
+        <w:rPr>
+          <w:rFonts w:ascii="Arial" w:cs="Arial" w:eastAsia="Arial" w:hAnsi="Arial"/>
+          <w:sz w:val="22"/>
+          <w:szCs w:val="22"/>
+        </w:rPr>
+        <w:t xml:space="preserve">The Requirements Dashboard activates at Phase 1 — Master PRD. Proceed to Section 4.3 to begin the workflow.</w:t>
       </w:r>
     </w:p>
     <w:p>
@@ -2871,7 +2981,7 @@
           <w:sz w:val="24"/>
           <w:szCs w:val="24"/>
         </w:rPr>
-        <w:t xml:space="preserve">4.3 Navigating the Workflow Engine</w:t>
+        <w:t xml:space="preserve">4.3 Navigating the Requirements Dashboard</w:t>
       </w:r>
     </w:p>
     <w:p>
@@ -2884,7 +2994,7 @@
           <w:sz w:val="22"/>
           <w:szCs w:val="22"/>
         </w:rPr>
-        <w:t xml:space="preserve">The Workflow Engine is the central navigation tool in the application. It tracks which phase and step the current project is on and presents the available actions for that step.</w:t>
+        <w:t xml:space="preserve">The Requirements Dashboard is the default view in Requirements mode and the implementor’s primary workspace. It answers two questions: what should I work on next, and how is the project progressing overall?</w:t>
       </w:r>
     </w:p>
     <w:p>
@@ -2897,7 +3007,53 @@
           <w:sz w:val="22"/>
           <w:szCs w:val="22"/>
         </w:rPr>
-        <w:t xml:space="preserve">At each step, the Workflow Engine shows:</w:t>
+        <w:t xml:space="preserve">The dashboard has three areas arranged vertically: a project summary bar at the top, the actionable work queue in the middle, and a collapsible full project inventory at the bottom.</w:t>
+      </w:r>
+    </w:p>
+    <w:p>
+      <w:pPr>
+        <w:spacing w:after="160"/>
+      </w:pPr>
+      <w:r>
+        <w:rPr>
+          <w:rFonts w:ascii="Arial" w:cs="Arial" w:eastAsia="Arial" w:hAnsi="Arial"/>
+          <w:b/>
+          <w:bCs/>
+          <w:sz w:val="22"/>
+          <w:szCs w:val="22"/>
+        </w:rPr>
+        <w:t xml:space="preserve">Project Summary Bar</w:t>
+      </w:r>
+      <w:r>
+        <w:rPr>
+          <w:rFonts w:ascii="Arial" w:cs="Arial" w:eastAsia="Arial" w:hAnsi="Arial"/>
+          <w:sz w:val="22"/>
+          <w:szCs w:val="22"/>
+        </w:rPr>
+        <w:t xml:space="preserve"> — Displayed at the top of the dashboard, this shows the client name, total work item count, and counts by status: complete, in progress, ready, blocked, and not started. This gives an immediate sense of project health at a glance.</w:t>
+      </w:r>
+    </w:p>
+    <w:p>
+      <w:pPr>
+        <w:spacing w:after="160"/>
+      </w:pPr>
+      <w:r>
+        <w:rPr>
+          <w:rFonts w:ascii="Arial" w:cs="Arial" w:eastAsia="Arial" w:hAnsi="Arial"/>
+          <w:b/>
+          <w:bCs/>
+          <w:sz w:val="22"/>
+          <w:szCs w:val="22"/>
+        </w:rPr>
+        <w:t xml:space="preserve">Actionable Work Queue</w:t>
+      </w:r>
+      <w:r>
+        <w:rPr>
+          <w:rFonts w:ascii="Arial" w:cs="Arial" w:eastAsia="Arial" w:hAnsi="Arial"/>
+          <w:sz w:val="22"/>
+          <w:szCs w:val="22"/>
+        </w:rPr>
+        <w:t xml:space="preserve"> — The central area of the dashboard, presenting only the work items that require attention. Items are organized into two groups:</w:t>
       </w:r>
     </w:p>
     <w:p>
@@ -2912,10 +3068,20 @@
       <w:r>
         <w:rPr>
           <w:rFonts w:ascii="Arial" w:cs="Arial" w:eastAsia="Arial" w:hAnsi="Arial"/>
-          <w:sz w:val="22"/>
-          <w:szCs w:val="22"/>
-        </w:rPr>
-        <w:t xml:space="preserve">The current phase and step name.</w:t>
+          <w:i/>
+          <w:iCs/>
+          <w:sz w:val="22"/>
+          <w:szCs w:val="22"/>
+        </w:rPr>
+        <w:t xml:space="preserve">Continue Work</w:t>
+      </w:r>
+      <w:r>
+        <w:rPr>
+          <w:rFonts w:ascii="Arial" w:cs="Arial" w:eastAsia="Arial" w:hAnsi="Arial"/>
+          <w:sz w:val="22"/>
+          <w:szCs w:val="22"/>
+        </w:rPr>
+        <w:t xml:space="preserve"> — items already in progress. These represent work the implementor has started and should finish before picking up new items. Each row shows the work item name (using the human-readable-first format, for example “Mentor Onboarding (MR-ONBOARD)”), the phase, status, and for AI-assisted items, the current session state and import status.</w:t>
       </w:r>
     </w:p>
     <w:p>
@@ -2930,10 +3096,469 @@
       <w:r>
         <w:rPr>
           <w:rFonts w:ascii="Arial" w:cs="Arial" w:eastAsia="Arial" w:hAnsi="Arial"/>
-          <w:sz w:val="22"/>
-          <w:szCs w:val="22"/>
-        </w:rPr>
-        <w:t xml:space="preserve">The inputs required for this step (documents, data, or configuration).</w:t>
+          <w:i/>
+          <w:iCs/>
+          <w:sz w:val="22"/>
+          <w:szCs w:val="22"/>
+        </w:rPr>
+        <w:t xml:space="preserve">Ready to Start</w:t>
+      </w:r>
+      <w:r>
+        <w:rPr>
+          <w:rFonts w:ascii="Arial" w:cs="Arial" w:eastAsia="Arial" w:hAnsi="Arial"/>
+          <w:sz w:val="22"/>
+          <w:szCs w:val="22"/>
+        </w:rPr>
+        <w:t xml:space="preserve"> — items whose upstream dependencies are all satisfied. Each row shows the work item name, phase, and a dependency indicator confirming that all prerequisites are met.</w:t>
+      </w:r>
+    </w:p>
+    <w:p>
+      <w:pPr>
+        <w:spacing w:after="160"/>
+      </w:pPr>
+      <w:r>
+        <w:rPr>
+          <w:rFonts w:ascii="Arial" w:cs="Arial" w:eastAsia="Arial" w:hAnsi="Arial"/>
+          <w:sz w:val="22"/>
+          <w:szCs w:val="22"/>
+        </w:rPr>
+        <w:t xml:space="preserve">Within each group, items are ordered by phase number, then by domain. The implementor can select any item — the ordering suggests priority without enforcing it. If no items are actionable, the dashboard displays a message. When all items are complete, it displays a project completion summary.</w:t>
+      </w:r>
+    </w:p>
+    <w:p>
+      <w:pPr>
+        <w:spacing w:after="160"/>
+      </w:pPr>
+      <w:r>
+        <w:rPr>
+          <w:rFonts w:ascii="Arial" w:cs="Arial" w:eastAsia="Arial" w:hAnsi="Arial"/>
+          <w:b/>
+          <w:bCs/>
+          <w:sz w:val="22"/>
+          <w:szCs w:val="22"/>
+        </w:rPr>
+        <w:t xml:space="preserve">Full Project Inventory</w:t>
+      </w:r>
+      <w:r>
+        <w:rPr>
+          <w:rFonts w:ascii="Arial" w:cs="Arial" w:eastAsia="Arial" w:hAnsi="Arial"/>
+          <w:sz w:val="22"/>
+          <w:szCs w:val="22"/>
+        </w:rPr>
+        <w:t xml:space="preserve"> — A collapsible section below the work queue labeled “All Work Items” shows every work item in the project, grouped by phase. Each phase group has a header with a completion indicator (for example, “3 of 5 complete”). Blocked items show the reason; not-started items show how many dependencies remain. This section is collapsed by default so the work queue occupies the primary visual space.</w:t>
+      </w:r>
+    </w:p>
+    <w:p>
+      <w:pPr>
+        <w:spacing w:after="160"/>
+      </w:pPr>
+      <w:r>
+        <w:rPr>
+          <w:rFonts w:ascii="Arial" w:cs="Arial" w:eastAsia="Arial" w:hAnsi="Arial"/>
+          <w:b/>
+          <w:bCs/>
+          <w:sz w:val="22"/>
+          <w:szCs w:val="22"/>
+        </w:rPr>
+        <w:t xml:space="preserve">Filtering</w:t>
+      </w:r>
+      <w:r>
+        <w:rPr>
+          <w:rFonts w:ascii="Arial" w:cs="Arial" w:eastAsia="Arial" w:hAnsi="Arial"/>
+          <w:sz w:val="22"/>
+          <w:szCs w:val="22"/>
+        </w:rPr>
+        <w:t xml:space="preserve"> — Optional filters above the work queue allow narrowing the display by domain, phase, or status. Filters apply to both the work queue and the full inventory simultaneously. Active filters appear as removable tags below the filter controls.</w:t>
+      </w:r>
+    </w:p>
+    <w:p>
+      <w:pPr>
+        <w:spacing w:after="160"/>
+      </w:pPr>
+      <w:r>
+        <w:rPr>
+          <w:rFonts w:ascii="Arial" w:cs="Arial" w:eastAsia="Arial" w:hAnsi="Arial"/>
+          <w:b/>
+          <w:bCs/>
+          <w:sz w:val="22"/>
+          <w:szCs w:val="22"/>
+        </w:rPr>
+        <w:t xml:space="preserve">Staleness Alerts</w:t>
+      </w:r>
+      <w:r>
+        <w:rPr>
+          <w:rFonts w:ascii="Arial" w:cs="Arial" w:eastAsia="Arial" w:hAnsi="Arial"/>
+          <w:sz w:val="22"/>
+          <w:szCs w:val="22"/>
+        </w:rPr>
+        <w:t xml:space="preserve"> — When completed work items have documents that are out of date, a staleness summary appears between the summary bar and the work queue. It shows the count of stale documents and links to the Documents view for regeneration.</w:t>
+      </w:r>
+    </w:p>
+    <w:p>
+      <w:pPr>
+        <w:spacing w:after="160"/>
+      </w:pPr>
+      <w:r>
+        <w:rPr>
+          <w:rFonts w:ascii="Arial" w:cs="Arial" w:eastAsia="Arial" w:hAnsi="Arial"/>
+          <w:b/>
+          <w:bCs/>
+          <w:sz w:val="22"/>
+          <w:szCs w:val="22"/>
+        </w:rPr>
+        <w:t xml:space="preserve">Navigating to a Work Item</w:t>
+      </w:r>
+      <w:r>
+        <w:rPr>
+          <w:rFonts w:ascii="Arial" w:cs="Arial" w:eastAsia="Arial" w:hAnsi="Arial"/>
+          <w:sz w:val="22"/>
+          <w:szCs w:val="22"/>
+        </w:rPr>
+        <w:t xml:space="preserve"> — Clicking any work item row opens the Work Item Detail view. A breadcrumb at the top updates to show the navigation path (for example, “Dashboard › Mentor Onboarding (MR-ONBOARD)”).</w:t>
+      </w:r>
+    </w:p>
+    <w:p>
+      <w:pPr>
+        <w:spacing w:after="80"/>
+      </w:pPr>
+    </w:p>
+    <w:p>
+      <w:pPr>
+        <w:pStyle w:val="Heading2"/>
+      </w:pPr>
+      <w:r>
+        <w:rPr>
+          <w:rFonts w:ascii="Arial" w:cs="Arial" w:eastAsia="Arial" w:hAnsi="Arial"/>
+          <w:b/>
+          <w:bCs/>
+          <w:color w:val="1F3864"/>
+          <w:sz w:val="24"/>
+          <w:szCs w:val="24"/>
+        </w:rPr>
+        <w:t xml:space="preserve">4.4 Generating and Using Prompts</w:t>
+      </w:r>
+    </w:p>
+    <w:p>
+      <w:pPr>
+        <w:spacing w:after="160"/>
+      </w:pPr>
+      <w:r>
+        <w:rPr>
+          <w:rFonts w:ascii="Arial" w:cs="Arial" w:eastAsia="Arial" w:hAnsi="Arial"/>
+          <w:sz w:val="22"/>
+          <w:szCs w:val="22"/>
+        </w:rPr>
+        <w:t xml:space="preserve">For AI-assisted phases, the application generates a structured prompt containing all context needed for the session. The implementor copies this prompt and takes it to an external AI session.</w:t>
+      </w:r>
+    </w:p>
+    <w:p>
+      <w:pPr>
+        <w:spacing w:after="160"/>
+      </w:pPr>
+      <w:r>
+        <w:rPr>
+          <w:rFonts w:ascii="Arial" w:cs="Arial" w:eastAsia="Arial" w:hAnsi="Arial"/>
+          <w:sz w:val="22"/>
+          <w:szCs w:val="22"/>
+        </w:rPr>
+        <w:t xml:space="preserve">To generate a prompt:</w:t>
+      </w:r>
+    </w:p>
+    <w:p>
+      <w:pPr>
+        <w:pStyle w:val="ListParagraph"/>
+        <w:numPr>
+          <w:ilvl w:val="0"/>
+          <w:numId w:val="3"/>
+        </w:numPr>
+        <w:spacing w:after="80"/>
+      </w:pPr>
+      <w:r>
+        <w:rPr>
+          <w:rFonts w:ascii="Arial" w:cs="Arial" w:eastAsia="Arial" w:hAnsi="Arial"/>
+          <w:sz w:val="22"/>
+          <w:szCs w:val="22"/>
+        </w:rPr>
+        <w:t xml:space="preserve">Open the work item from the Requirements Dashboard to view its detail.</w:t>
+      </w:r>
+    </w:p>
+    <w:p>
+      <w:pPr>
+        <w:pStyle w:val="ListParagraph"/>
+        <w:numPr>
+          <w:ilvl w:val="0"/>
+          <w:numId w:val="3"/>
+        </w:numPr>
+        <w:spacing w:after="80"/>
+      </w:pPr>
+      <w:r>
+        <w:rPr>
+          <w:rFonts w:ascii="Arial" w:cs="Arial" w:eastAsia="Arial" w:hAnsi="Arial"/>
+          <w:sz w:val="22"/>
+          <w:szCs w:val="22"/>
+        </w:rPr>
+        <w:t xml:space="preserve">Click Generate Prompt. The application assembles relevant context from the project database.</w:t>
+      </w:r>
+    </w:p>
+    <w:p>
+      <w:pPr>
+        <w:pStyle w:val="ListParagraph"/>
+        <w:numPr>
+          <w:ilvl w:val="0"/>
+          <w:numId w:val="3"/>
+        </w:numPr>
+        <w:spacing w:after="80"/>
+      </w:pPr>
+      <w:r>
+        <w:rPr>
+          <w:rFonts w:ascii="Arial" w:cs="Arial" w:eastAsia="Arial" w:hAnsi="Arial"/>
+          <w:sz w:val="22"/>
+          <w:szCs w:val="22"/>
+        </w:rPr>
+        <w:t xml:space="preserve">Copy the prompt and open an external AI session.</w:t>
+      </w:r>
+    </w:p>
+    <w:p>
+      <w:pPr>
+        <w:pStyle w:val="ListParagraph"/>
+        <w:numPr>
+          <w:ilvl w:val="0"/>
+          <w:numId w:val="3"/>
+        </w:numPr>
+        <w:spacing w:after="80"/>
+      </w:pPr>
+      <w:r>
+        <w:rPr>
+          <w:rFonts w:ascii="Arial" w:cs="Arial" w:eastAsia="Arial" w:hAnsi="Arial"/>
+          <w:sz w:val="22"/>
+          <w:szCs w:val="22"/>
+        </w:rPr>
+        <w:t xml:space="preserve">Upload any required documents as specified in the prompt header.</w:t>
+      </w:r>
+    </w:p>
+    <w:p>
+      <w:pPr>
+        <w:pStyle w:val="ListParagraph"/>
+        <w:numPr>
+          <w:ilvl w:val="0"/>
+          <w:numId w:val="3"/>
+        </w:numPr>
+        <w:spacing w:after="80"/>
+      </w:pPr>
+      <w:r>
+        <w:rPr>
+          <w:rFonts w:ascii="Arial" w:cs="Arial" w:eastAsia="Arial" w:hAnsi="Arial"/>
+          <w:sz w:val="22"/>
+          <w:szCs w:val="22"/>
+        </w:rPr>
+        <w:t xml:space="preserve">Run the session and download or copy the structured output.</w:t>
+      </w:r>
+    </w:p>
+    <w:p>
+      <w:pPr>
+        <w:spacing w:after="80"/>
+      </w:pPr>
+    </w:p>
+    <w:p>
+      <w:pPr>
+        <w:spacing w:after="160"/>
+      </w:pPr>
+      <w:r>
+        <w:rPr>
+          <w:rFonts w:ascii="Arial" w:cs="Arial" w:eastAsia="Arial" w:hAnsi="Arial"/>
+          <w:sz w:val="22"/>
+          <w:szCs w:val="22"/>
+        </w:rPr>
+        <w:t xml:space="preserve">Each prompt is self-contained — it includes the relevant context, the task description, and the expected output format. Do not modify the prompt structure, as the Import Processor relies on it to parse the result.</w:t>
+      </w:r>
+    </w:p>
+    <w:p>
+      <w:pPr>
+        <w:spacing w:after="80"/>
+      </w:pPr>
+    </w:p>
+    <w:p>
+      <w:pPr>
+        <w:pStyle w:val="Heading2"/>
+      </w:pPr>
+      <w:r>
+        <w:rPr>
+          <w:rFonts w:ascii="Arial" w:cs="Arial" w:eastAsia="Arial" w:hAnsi="Arial"/>
+          <w:b/>
+          <w:bCs/>
+          <w:color w:val="1F3864"/>
+          <w:sz w:val="24"/>
+          <w:szCs w:val="24"/>
+        </w:rPr>
+        <w:t xml:space="preserve">4.5 Importing Results</w:t>
+      </w:r>
+    </w:p>
+    <w:p>
+      <w:pPr>
+        <w:spacing w:after="160"/>
+      </w:pPr>
+      <w:r>
+        <w:rPr>
+          <w:rFonts w:ascii="Arial" w:cs="Arial" w:eastAsia="Arial" w:hAnsi="Arial"/>
+          <w:sz w:val="22"/>
+          <w:szCs w:val="22"/>
+        </w:rPr>
+        <w:t xml:space="preserve">After completing an AI session, import the output into CRM Builder using the Import Processor.</w:t>
+      </w:r>
+    </w:p>
+    <w:p>
+      <w:pPr>
+        <w:spacing w:after="160"/>
+      </w:pPr>
+      <w:r>
+        <w:rPr>
+          <w:rFonts w:ascii="Arial" w:cs="Arial" w:eastAsia="Arial" w:hAnsi="Arial"/>
+          <w:sz w:val="22"/>
+          <w:szCs w:val="22"/>
+        </w:rPr>
+        <w:t xml:space="preserve">To import a result:</w:t>
+      </w:r>
+    </w:p>
+    <w:p>
+      <w:pPr>
+        <w:pStyle w:val="ListParagraph"/>
+        <w:numPr>
+          <w:ilvl w:val="0"/>
+          <w:numId w:val="3"/>
+        </w:numPr>
+        <w:spacing w:after="80"/>
+      </w:pPr>
+      <w:r>
+        <w:rPr>
+          <w:rFonts w:ascii="Arial" w:cs="Arial" w:eastAsia="Arial" w:hAnsi="Arial"/>
+          <w:sz w:val="22"/>
+          <w:szCs w:val="22"/>
+        </w:rPr>
+        <w:t xml:space="preserve">Return to the work item’s detail view.</w:t>
+      </w:r>
+    </w:p>
+    <w:p>
+      <w:pPr>
+        <w:pStyle w:val="ListParagraph"/>
+        <w:numPr>
+          <w:ilvl w:val="0"/>
+          <w:numId w:val="3"/>
+        </w:numPr>
+        <w:spacing w:after="80"/>
+      </w:pPr>
+      <w:r>
+        <w:rPr>
+          <w:rFonts w:ascii="Arial" w:cs="Arial" w:eastAsia="Arial" w:hAnsi="Arial"/>
+          <w:sz w:val="22"/>
+          <w:szCs w:val="22"/>
+        </w:rPr>
+        <w:t xml:space="preserve">Click Import Results and select or paste the output from the AI session.</w:t>
+      </w:r>
+    </w:p>
+    <w:p>
+      <w:pPr>
+        <w:pStyle w:val="ListParagraph"/>
+        <w:numPr>
+          <w:ilvl w:val="0"/>
+          <w:numId w:val="3"/>
+        </w:numPr>
+        <w:spacing w:after="80"/>
+      </w:pPr>
+      <w:r>
+        <w:rPr>
+          <w:rFonts w:ascii="Arial" w:cs="Arial" w:eastAsia="Arial" w:hAnsi="Arial"/>
+          <w:sz w:val="22"/>
+          <w:szCs w:val="22"/>
+        </w:rPr>
+        <w:t xml:space="preserve">The Import Processor parses and validates the content.</w:t>
+      </w:r>
+    </w:p>
+    <w:p>
+      <w:pPr>
+        <w:pStyle w:val="ListParagraph"/>
+        <w:numPr>
+          <w:ilvl w:val="0"/>
+          <w:numId w:val="3"/>
+        </w:numPr>
+        <w:spacing w:after="80"/>
+      </w:pPr>
+      <w:r>
+        <w:rPr>
+          <w:rFonts w:ascii="Arial" w:cs="Arial" w:eastAsia="Arial" w:hAnsi="Arial"/>
+          <w:sz w:val="22"/>
+          <w:szCs w:val="22"/>
+        </w:rPr>
+        <w:t xml:space="preserve">Review any warnings or errors flagged by the processor.</w:t>
+      </w:r>
+    </w:p>
+    <w:p>
+      <w:pPr>
+        <w:pStyle w:val="ListParagraph"/>
+        <w:numPr>
+          <w:ilvl w:val="0"/>
+          <w:numId w:val="3"/>
+        </w:numPr>
+        <w:spacing w:after="80"/>
+      </w:pPr>
+      <w:r>
+        <w:rPr>
+          <w:rFonts w:ascii="Arial" w:cs="Arial" w:eastAsia="Arial" w:hAnsi="Arial"/>
+          <w:sz w:val="22"/>
+          <w:szCs w:val="22"/>
+        </w:rPr>
+        <w:t xml:space="preserve">Confirm the import. Content is committed to the project database.</w:t>
+      </w:r>
+    </w:p>
+    <w:p>
+      <w:pPr>
+        <w:spacing w:after="80"/>
+      </w:pPr>
+    </w:p>
+    <w:p>
+      <w:pPr>
+        <w:spacing w:after="160"/>
+      </w:pPr>
+      <w:r>
+        <w:rPr>
+          <w:rFonts w:ascii="Arial" w:cs="Arial" w:eastAsia="Arial" w:hAnsi="Arial"/>
+          <w:sz w:val="22"/>
+          <w:szCs w:val="22"/>
+        </w:rPr>
+        <w:t xml:space="preserve">The Import Processor validates structure and content before committing. If errors are found, the import is held and the implementor is shown specific issues to resolve before retrying.</w:t>
+      </w:r>
+    </w:p>
+    <w:p>
+      <w:pPr>
+        <w:spacing w:after="80"/>
+      </w:pPr>
+    </w:p>
+    <w:p>
+      <w:pPr>
+        <w:pStyle w:val="Heading2"/>
+      </w:pPr>
+      <w:r>
+        <w:rPr>
+          <w:rFonts w:ascii="Arial" w:cs="Arial" w:eastAsia="Arial" w:hAnsi="Arial"/>
+          <w:b/>
+          <w:bCs/>
+          <w:color w:val="1F3864"/>
+          <w:sz w:val="24"/>
+          <w:szCs w:val="24"/>
+        </w:rPr>
+        <w:t xml:space="preserve">4.6 Impact Analysis</w:t>
+      </w:r>
+    </w:p>
+    <w:p>
+      <w:pPr>
+        <w:spacing w:after="160"/>
+      </w:pPr>
+      <w:r>
+        <w:rPr>
+          <w:rFonts w:ascii="Arial" w:cs="Arial" w:eastAsia="Arial" w:hAnsi="Arial"/>
+          <w:sz w:val="22"/>
+          <w:szCs w:val="22"/>
+        </w:rPr>
+        <w:t xml:space="preserve">Before committing imported content, CRM Builder runs an impact analysis. This checks for:</w:t>
       </w:r>
     </w:p>
     <w:p>
@@ -2951,7 +3576,43 @@
           <w:sz w:val="22"/>
           <w:szCs w:val="22"/>
         </w:rPr>
-        <w:t xml:space="preserve">The action to take (generate a prompt, run configuration, or review results).</w:t>
+        <w:t xml:space="preserve">Conflicts with existing content in the database (for example, a new process referencing an entity that has not been defined).</w:t>
+      </w:r>
+    </w:p>
+    <w:p>
+      <w:pPr>
+        <w:pStyle w:val="ListParagraph"/>
+        <w:numPr>
+          <w:ilvl w:val="0"/>
+          <w:numId w:val="2"/>
+        </w:numPr>
+        <w:spacing w:after="80"/>
+      </w:pPr>
+      <w:r>
+        <w:rPr>
+          <w:rFonts w:ascii="Arial" w:cs="Arial" w:eastAsia="Arial" w:hAnsi="Arial"/>
+          <w:sz w:val="22"/>
+          <w:szCs w:val="22"/>
+        </w:rPr>
+        <w:t xml:space="preserve">Downstream effects — changes to an entity or process that may affect other documents already in the database.</w:t>
+      </w:r>
+    </w:p>
+    <w:p>
+      <w:pPr>
+        <w:pStyle w:val="ListParagraph"/>
+        <w:numPr>
+          <w:ilvl w:val="0"/>
+          <w:numId w:val="2"/>
+        </w:numPr>
+        <w:spacing w:after="80"/>
+      </w:pPr>
+      <w:r>
+        <w:rPr>
+          <w:rFonts w:ascii="Arial" w:cs="Arial" w:eastAsia="Arial" w:hAnsi="Arial"/>
+          <w:sz w:val="22"/>
+          <w:szCs w:val="22"/>
+        </w:rPr>
+        <w:t xml:space="preserve">Gaps — required fields or relationships that are missing from the imported content.</w:t>
       </w:r>
     </w:p>
     <w:p>
@@ -2964,7 +3625,7 @@
           <w:sz w:val="22"/>
           <w:szCs w:val="22"/>
         </w:rPr>
-        <w:t xml:space="preserve">The workflow enforces sequencing — a step cannot be marked complete until its required inputs are present and its output has been validated.</w:t>
+        <w:t xml:space="preserve">The implementor reviews the impact report and confirms or cancels the commit. All committed changes are recorded in the audit trail.</w:t>
       </w:r>
     </w:p>
     <w:p>
@@ -2985,7 +3646,7 @@
           <w:sz w:val="24"/>
           <w:szCs w:val="24"/>
         </w:rPr>
-        <w:t xml:space="preserve">4.4 Generating and Using Prompts</w:t>
+        <w:t xml:space="preserve">4.7 Generating Documents and YAML</w:t>
       </w:r>
     </w:p>
     <w:p>
@@ -2998,20 +3659,7 @@
           <w:sz w:val="22"/>
           <w:szCs w:val="22"/>
         </w:rPr>
-        <w:t xml:space="preserve">For AI-assisted phases, the application generates a structured prompt containing all context needed for the session. The implementor copies this prompt and takes it to an external AI session.</w:t>
-      </w:r>
-    </w:p>
-    <w:p>
-      <w:pPr>
-        <w:spacing w:after="160"/>
-      </w:pPr>
-      <w:r>
-        <w:rPr>
-          <w:rFonts w:ascii="Arial" w:cs="Arial" w:eastAsia="Arial" w:hAnsi="Arial"/>
-          <w:sz w:val="22"/>
-          <w:szCs w:val="22"/>
-        </w:rPr>
-        <w:t xml:space="preserve">To generate a prompt:</w:t>
+        <w:t xml:space="preserve">At the appropriate milestones, CRM Builder generates outputs from the project database:</w:t>
       </w:r>
     </w:p>
     <w:p>
@@ -3019,7 +3667,7 @@
         <w:pStyle w:val="ListParagraph"/>
         <w:numPr>
           <w:ilvl w:val="0"/>
-          <w:numId w:val="3"/>
+          <w:numId w:val="2"/>
         </w:numPr>
         <w:spacing w:after="80"/>
       </w:pPr>
@@ -3029,7 +3677,7 @@
           <w:sz w:val="22"/>
           <w:szCs w:val="22"/>
         </w:rPr>
-        <w:t xml:space="preserve">Navigate to the current step in the Workflow Engine.</w:t>
+        <w:t xml:space="preserve">Word documents — process documents, entity PRDs, domain PRDs, and the Master PRD are generated as formatted Word documents for stakeholder review.</w:t>
       </w:r>
     </w:p>
     <w:p>
@@ -3037,7 +3685,7 @@
         <w:pStyle w:val="ListParagraph"/>
         <w:numPr>
           <w:ilvl w:val="0"/>
-          <w:numId w:val="3"/>
+          <w:numId w:val="2"/>
         </w:numPr>
         <w:spacing w:after="80"/>
       </w:pPr>
@@ -3047,67 +3695,8 @@
           <w:sz w:val="22"/>
           <w:szCs w:val="22"/>
         </w:rPr>
-        <w:t xml:space="preserve">Click Generate Prompt. The application assembles relevant context from the project database.</w:t>
-      </w:r>
-    </w:p>
-    <w:p>
-      <w:pPr>
-        <w:pStyle w:val="ListParagraph"/>
-        <w:numPr>
-          <w:ilvl w:val="0"/>
-          <w:numId w:val="3"/>
-        </w:numPr>
-        <w:spacing w:after="80"/>
-      </w:pPr>
-      <w:r>
-        <w:rPr>
-          <w:rFonts w:ascii="Arial" w:cs="Arial" w:eastAsia="Arial" w:hAnsi="Arial"/>
-          <w:sz w:val="22"/>
-          <w:szCs w:val="22"/>
-        </w:rPr>
-        <w:t xml:space="preserve">Copy the prompt and open an external AI session.</w:t>
-      </w:r>
-    </w:p>
-    <w:p>
-      <w:pPr>
-        <w:pStyle w:val="ListParagraph"/>
-        <w:numPr>
-          <w:ilvl w:val="0"/>
-          <w:numId w:val="3"/>
-        </w:numPr>
-        <w:spacing w:after="80"/>
-      </w:pPr>
-      <w:r>
-        <w:rPr>
-          <w:rFonts w:ascii="Arial" w:cs="Arial" w:eastAsia="Arial" w:hAnsi="Arial"/>
-          <w:sz w:val="22"/>
-          <w:szCs w:val="22"/>
-        </w:rPr>
-        <w:t xml:space="preserve">Upload any required documents as specified in the prompt header.</w:t>
-      </w:r>
-    </w:p>
-    <w:p>
-      <w:pPr>
-        <w:pStyle w:val="ListParagraph"/>
-        <w:numPr>
-          <w:ilvl w:val="0"/>
-          <w:numId w:val="3"/>
-        </w:numPr>
-        <w:spacing w:after="80"/>
-      </w:pPr>
-      <w:r>
-        <w:rPr>
-          <w:rFonts w:ascii="Arial" w:cs="Arial" w:eastAsia="Arial" w:hAnsi="Arial"/>
-          <w:sz w:val="22"/>
-          <w:szCs w:val="22"/>
-        </w:rPr>
-        <w:t xml:space="preserve">Run the session and download or copy the structured output.</w:t>
-      </w:r>
-    </w:p>
-    <w:p>
-      <w:pPr>
-        <w:spacing w:after="80"/>
-      </w:pPr>
+        <w:t xml:space="preserve">YAML configuration files — after Phase 6 (Domain Reconciliation) is complete for a domain, CRM Builder generates YAML files that describe the CRM configuration declaratively.</w:t>
+      </w:r>
     </w:p>
     <w:p>
       <w:pPr>
@@ -3119,7 +3708,7 @@
           <w:sz w:val="22"/>
           <w:szCs w:val="22"/>
         </w:rPr>
-        <w:t xml:space="preserve">Each prompt is self-contained — it includes the relevant context, the task description, and the expected output format. Do not modify the prompt structure, as the Import Processor relies on it to parse the result.</w:t>
+        <w:t xml:space="preserve">Generated documents are written to the client repository in the designated output folders. YAML files are written to the programs folder, where they are consumed by the CRM configuration step in Phase 11.</w:t>
       </w:r>
     </w:p>
     <w:p>
@@ -3140,7 +3729,7 @@
           <w:sz w:val="24"/>
           <w:szCs w:val="24"/>
         </w:rPr>
-        <w:t xml:space="preserve">4.5 Importing Results</w:t>
+        <w:t xml:space="preserve">4.8 Deploying and Configuring the CRM</w:t>
       </w:r>
     </w:p>
     <w:p>
@@ -3153,7 +3742,7 @@
           <w:sz w:val="22"/>
           <w:szCs w:val="22"/>
         </w:rPr>
-        <w:t xml:space="preserve">After completing an AI session, import the output into CRM Builder using the Import Processor.</w:t>
+        <w:t xml:space="preserve">In Phase 10, the implementor provisions a new CRM instance using the Deploy panel. The Deploy Wizard guides the implementor through server setup, including domain configuration and SSL certificate issuance.</w:t>
       </w:r>
     </w:p>
     <w:p>
@@ -3166,103 +3755,8 @@
           <w:sz w:val="22"/>
           <w:szCs w:val="22"/>
         </w:rPr>
-        <w:t xml:space="preserve">To import a result:</w:t>
-      </w:r>
-    </w:p>
-    <w:p>
-      <w:pPr>
-        <w:pStyle w:val="ListParagraph"/>
-        <w:numPr>
-          <w:ilvl w:val="0"/>
-          <w:numId w:val="3"/>
-        </w:numPr>
-        <w:spacing w:after="80"/>
-      </w:pPr>
-      <w:r>
-        <w:rPr>
-          <w:rFonts w:ascii="Arial" w:cs="Arial" w:eastAsia="Arial" w:hAnsi="Arial"/>
-          <w:sz w:val="22"/>
-          <w:szCs w:val="22"/>
-        </w:rPr>
-        <w:t xml:space="preserve">Return to the current step in the Workflow Engine.</w:t>
-      </w:r>
-    </w:p>
-    <w:p>
-      <w:pPr>
-        <w:pStyle w:val="ListParagraph"/>
-        <w:numPr>
-          <w:ilvl w:val="0"/>
-          <w:numId w:val="3"/>
-        </w:numPr>
-        <w:spacing w:after="80"/>
-      </w:pPr>
-      <w:r>
-        <w:rPr>
-          <w:rFonts w:ascii="Arial" w:cs="Arial" w:eastAsia="Arial" w:hAnsi="Arial"/>
-          <w:sz w:val="22"/>
-          <w:szCs w:val="22"/>
-        </w:rPr>
-        <w:t xml:space="preserve">Click Import Result and select or paste the output from the AI session.</w:t>
-      </w:r>
-    </w:p>
-    <w:p>
-      <w:pPr>
-        <w:pStyle w:val="ListParagraph"/>
-        <w:numPr>
-          <w:ilvl w:val="0"/>
-          <w:numId w:val="3"/>
-        </w:numPr>
-        <w:spacing w:after="80"/>
-      </w:pPr>
-      <w:r>
-        <w:rPr>
-          <w:rFonts w:ascii="Arial" w:cs="Arial" w:eastAsia="Arial" w:hAnsi="Arial"/>
-          <w:sz w:val="22"/>
-          <w:szCs w:val="22"/>
-        </w:rPr>
-        <w:t xml:space="preserve">The Import Processor parses and validates the content.</w:t>
-      </w:r>
-    </w:p>
-    <w:p>
-      <w:pPr>
-        <w:pStyle w:val="ListParagraph"/>
-        <w:numPr>
-          <w:ilvl w:val="0"/>
-          <w:numId w:val="3"/>
-        </w:numPr>
-        <w:spacing w:after="80"/>
-      </w:pPr>
-      <w:r>
-        <w:rPr>
-          <w:rFonts w:ascii="Arial" w:cs="Arial" w:eastAsia="Arial" w:hAnsi="Arial"/>
-          <w:sz w:val="22"/>
-          <w:szCs w:val="22"/>
-        </w:rPr>
-        <w:t xml:space="preserve">Review any warnings or errors flagged by the processor.</w:t>
-      </w:r>
-    </w:p>
-    <w:p>
-      <w:pPr>
-        <w:pStyle w:val="ListParagraph"/>
-        <w:numPr>
-          <w:ilvl w:val="0"/>
-          <w:numId w:val="3"/>
-        </w:numPr>
-        <w:spacing w:after="80"/>
-      </w:pPr>
-      <w:r>
-        <w:rPr>
-          <w:rFonts w:ascii="Arial" w:cs="Arial" w:eastAsia="Arial" w:hAnsi="Arial"/>
-          <w:sz w:val="22"/>
-          <w:szCs w:val="22"/>
-        </w:rPr>
-        <w:t xml:space="preserve">Confirm the import. Content is committed to the project database.</w:t>
-      </w:r>
-    </w:p>
-    <w:p>
-      <w:pPr>
-        <w:spacing w:after="80"/>
-      </w:pPr>
+        <w:t xml:space="preserve">In Phase 11, the YAML files generated in Phase 8 are applied to the live CRM instance. The application connects to the instance, reads the YAML configuration, and applies fields, layouts, and relationships via the CRM API.</w:t>
+      </w:r>
     </w:p>
     <w:p>
       <w:pPr>
@@ -3274,7 +3768,7 @@
           <w:sz w:val="22"/>
           <w:szCs w:val="22"/>
         </w:rPr>
-        <w:t xml:space="preserve">The Import Processor validates structure and content before committing. If errors are found, the import is held and the implementor is shown specific issues to resolve before retrying.</w:t>
+        <w:t xml:space="preserve">Each configuration action is a check-then-act operation: the application first checks the current state of the CRM, compares it to the YAML specification, and applies only the changes required. A report is generated after each run.</w:t>
       </w:r>
     </w:p>
     <w:p>
@@ -3295,7 +3789,7 @@
           <w:sz w:val="24"/>
           <w:szCs w:val="24"/>
         </w:rPr>
-        <w:t xml:space="preserve">4.6 Impact Analysis</w:t>
+        <w:t xml:space="preserve">4.9 Verification</w:t>
       </w:r>
     </w:p>
     <w:p>
@@ -3308,251 +3802,7 @@
           <w:sz w:val="22"/>
           <w:szCs w:val="22"/>
         </w:rPr>
-        <w:t xml:space="preserve">Before committing imported content, CRM Builder runs an impact analysis. This checks for:</w:t>
-      </w:r>
-    </w:p>
-    <w:p>
-      <w:pPr>
-        <w:pStyle w:val="ListParagraph"/>
-        <w:numPr>
-          <w:ilvl w:val="0"/>
-          <w:numId w:val="2"/>
-        </w:numPr>
-        <w:spacing w:after="80"/>
-      </w:pPr>
-      <w:r>
-        <w:rPr>
-          <w:rFonts w:ascii="Arial" w:cs="Arial" w:eastAsia="Arial" w:hAnsi="Arial"/>
-          <w:sz w:val="22"/>
-          <w:szCs w:val="22"/>
-        </w:rPr>
-        <w:t xml:space="preserve">Conflicts with existing content in the database (for example, a new process referencing an entity that has not been defined).</w:t>
-      </w:r>
-    </w:p>
-    <w:p>
-      <w:pPr>
-        <w:pStyle w:val="ListParagraph"/>
-        <w:numPr>
-          <w:ilvl w:val="0"/>
-          <w:numId w:val="2"/>
-        </w:numPr>
-        <w:spacing w:after="80"/>
-      </w:pPr>
-      <w:r>
-        <w:rPr>
-          <w:rFonts w:ascii="Arial" w:cs="Arial" w:eastAsia="Arial" w:hAnsi="Arial"/>
-          <w:sz w:val="22"/>
-          <w:szCs w:val="22"/>
-        </w:rPr>
-        <w:t xml:space="preserve">Downstream effects — changes to an entity or process that may affect other documents already in the database.</w:t>
-      </w:r>
-    </w:p>
-    <w:p>
-      <w:pPr>
-        <w:pStyle w:val="ListParagraph"/>
-        <w:numPr>
-          <w:ilvl w:val="0"/>
-          <w:numId w:val="2"/>
-        </w:numPr>
-        <w:spacing w:after="80"/>
-      </w:pPr>
-      <w:r>
-        <w:rPr>
-          <w:rFonts w:ascii="Arial" w:cs="Arial" w:eastAsia="Arial" w:hAnsi="Arial"/>
-          <w:sz w:val="22"/>
-          <w:szCs w:val="22"/>
-        </w:rPr>
-        <w:t xml:space="preserve">Gaps — required fields or relationships that are missing from the imported content.</w:t>
-      </w:r>
-    </w:p>
-    <w:p>
-      <w:pPr>
-        <w:spacing w:after="160"/>
-      </w:pPr>
-      <w:r>
-        <w:rPr>
-          <w:rFonts w:ascii="Arial" w:cs="Arial" w:eastAsia="Arial" w:hAnsi="Arial"/>
-          <w:sz w:val="22"/>
-          <w:szCs w:val="22"/>
-        </w:rPr>
-        <w:t xml:space="preserve">The implementor reviews the impact report and confirms or cancels the commit. All committed changes are recorded in the audit trail.</w:t>
-      </w:r>
-    </w:p>
-    <w:p>
-      <w:pPr>
-        <w:spacing w:after="80"/>
-      </w:pPr>
-    </w:p>
-    <w:p>
-      <w:pPr>
-        <w:pStyle w:val="Heading2"/>
-      </w:pPr>
-      <w:r>
-        <w:rPr>
-          <w:rFonts w:ascii="Arial" w:cs="Arial" w:eastAsia="Arial" w:hAnsi="Arial"/>
-          <w:b/>
-          <w:bCs/>
-          <w:color w:val="1F3864"/>
-          <w:sz w:val="24"/>
-          <w:szCs w:val="24"/>
-        </w:rPr>
-        <w:t xml:space="preserve">4.7 Generating Documents and YAML</w:t>
-      </w:r>
-    </w:p>
-    <w:p>
-      <w:pPr>
-        <w:spacing w:after="160"/>
-      </w:pPr>
-      <w:r>
-        <w:rPr>
-          <w:rFonts w:ascii="Arial" w:cs="Arial" w:eastAsia="Arial" w:hAnsi="Arial"/>
-          <w:sz w:val="22"/>
-          <w:szCs w:val="22"/>
-        </w:rPr>
-        <w:t xml:space="preserve">At the appropriate milestones, CRM Builder generates outputs from the project database:</w:t>
-      </w:r>
-    </w:p>
-    <w:p>
-      <w:pPr>
-        <w:pStyle w:val="ListParagraph"/>
-        <w:numPr>
-          <w:ilvl w:val="0"/>
-          <w:numId w:val="2"/>
-        </w:numPr>
-        <w:spacing w:after="80"/>
-      </w:pPr>
-      <w:r>
-        <w:rPr>
-          <w:rFonts w:ascii="Arial" w:cs="Arial" w:eastAsia="Arial" w:hAnsi="Arial"/>
-          <w:sz w:val="22"/>
-          <w:szCs w:val="22"/>
-        </w:rPr>
-        <w:t xml:space="preserve">Word documents — process documents, entity PRDs, domain PRDs, and the Master PRD are generated as formatted Word documents for stakeholder review.</w:t>
-      </w:r>
-    </w:p>
-    <w:p>
-      <w:pPr>
-        <w:pStyle w:val="ListParagraph"/>
-        <w:numPr>
-          <w:ilvl w:val="0"/>
-          <w:numId w:val="2"/>
-        </w:numPr>
-        <w:spacing w:after="80"/>
-      </w:pPr>
-      <w:r>
-        <w:rPr>
-          <w:rFonts w:ascii="Arial" w:cs="Arial" w:eastAsia="Arial" w:hAnsi="Arial"/>
-          <w:sz w:val="22"/>
-          <w:szCs w:val="22"/>
-        </w:rPr>
-        <w:t xml:space="preserve">YAML configuration files — after Phase 5 (Domain Reconciliation) is complete for a domain, CRM Builder generates YAML files that describe the CRM configuration declaratively.</w:t>
-      </w:r>
-    </w:p>
-    <w:p>
-      <w:pPr>
-        <w:spacing w:after="160"/>
-      </w:pPr>
-      <w:r>
-        <w:rPr>
-          <w:rFonts w:ascii="Arial" w:cs="Arial" w:eastAsia="Arial" w:hAnsi="Arial"/>
-          <w:sz w:val="22"/>
-          <w:szCs w:val="22"/>
-        </w:rPr>
-        <w:t xml:space="preserve">Generated documents are written to the client repository in the designated output folders. YAML files are written to the programs folder, where they are consumed by the CRM configuration step in Phase 10.</w:t>
-      </w:r>
-    </w:p>
-    <w:p>
-      <w:pPr>
-        <w:spacing w:after="80"/>
-      </w:pPr>
-    </w:p>
-    <w:p>
-      <w:pPr>
-        <w:pStyle w:val="Heading2"/>
-      </w:pPr>
-      <w:r>
-        <w:rPr>
-          <w:rFonts w:ascii="Arial" w:cs="Arial" w:eastAsia="Arial" w:hAnsi="Arial"/>
-          <w:b/>
-          <w:bCs/>
-          <w:color w:val="1F3864"/>
-          <w:sz w:val="24"/>
-          <w:szCs w:val="24"/>
-        </w:rPr>
-        <w:t xml:space="preserve">4.8 Deploying and Configuring the CRM</w:t>
-      </w:r>
-    </w:p>
-    <w:p>
-      <w:pPr>
-        <w:spacing w:after="160"/>
-      </w:pPr>
-      <w:r>
-        <w:rPr>
-          <w:rFonts w:ascii="Arial" w:cs="Arial" w:eastAsia="Arial" w:hAnsi="Arial"/>
-          <w:sz w:val="22"/>
-          <w:szCs w:val="22"/>
-        </w:rPr>
-        <w:t xml:space="preserve">In Phase 9, the implementor provisions a new CRM instance using the Deploy panel. The Deploy Wizard guides the implementor through server setup, including domain configuration and SSL certificate issuance.</w:t>
-      </w:r>
-    </w:p>
-    <w:p>
-      <w:pPr>
-        <w:spacing w:after="160"/>
-      </w:pPr>
-      <w:r>
-        <w:rPr>
-          <w:rFonts w:ascii="Arial" w:cs="Arial" w:eastAsia="Arial" w:hAnsi="Arial"/>
-          <w:sz w:val="22"/>
-          <w:szCs w:val="22"/>
-        </w:rPr>
-        <w:t xml:space="preserve">In Phase 10, the YAML files generated in Phase 7 are applied to the live CRM instance. The application connects to the instance, reads the YAML configuration, and applies fields, layouts, and relationships via the CRM API.</w:t>
-      </w:r>
-    </w:p>
-    <w:p>
-      <w:pPr>
-        <w:spacing w:after="160"/>
-      </w:pPr>
-      <w:r>
-        <w:rPr>
-          <w:rFonts w:ascii="Arial" w:cs="Arial" w:eastAsia="Arial" w:hAnsi="Arial"/>
-          <w:sz w:val="22"/>
-          <w:szCs w:val="22"/>
-        </w:rPr>
-        <w:t xml:space="preserve">Each configuration action is a check-then-act operation: the application first checks the current state of the CRM, compares it to the YAML specification, and applies only the changes required. A report is generated after each run.</w:t>
-      </w:r>
-    </w:p>
-    <w:p>
-      <w:pPr>
-        <w:spacing w:after="80"/>
-      </w:pPr>
-    </w:p>
-    <w:p>
-      <w:pPr>
-        <w:pStyle w:val="Heading2"/>
-      </w:pPr>
-      <w:r>
-        <w:rPr>
-          <w:rFonts w:ascii="Arial" w:cs="Arial" w:eastAsia="Arial" w:hAnsi="Arial"/>
-          <w:b/>
-          <w:bCs/>
-          <w:color w:val="1F3864"/>
-          <w:sz w:val="24"/>
-          <w:szCs w:val="24"/>
-        </w:rPr>
-        <w:t xml:space="preserve">4.9 Verification</w:t>
-      </w:r>
-    </w:p>
-    <w:p>
-      <w:pPr>
-        <w:spacing w:after="160"/>
-      </w:pPr>
-      <w:r>
-        <w:rPr>
-          <w:rFonts w:ascii="Arial" w:cs="Arial" w:eastAsia="Arial" w:hAnsi="Arial"/>
-          <w:sz w:val="22"/>
-          <w:szCs w:val="22"/>
-        </w:rPr>
-        <w:t xml:space="preserve">In Phase 11, CRM Builder generates a Verification Specification document. This document maps each requirement from the process documents to a testable verification step. The implementor and client use this document to confirm that the configured CRM meets all documented requirements.</w:t>
+        <w:t xml:space="preserve">In Phase 12, CRM Builder generates a Verification Specification document. This document maps each requirement from the process documents to a testable verification step. The implementor and client use this document to confirm that the configured CRM meets all documented requirements.</w:t>
       </w:r>
     </w:p>
     <w:p>
@@ -4084,7 +4334,7 @@
                 <w:sz w:val="20"/>
                 <w:szCs w:val="20"/>
               </w:rPr>
-              <w:t xml:space="preserve">Workflow Engine</w:t>
+              <w:t xml:space="preserve">Requirements Dashboard</w:t>
             </w:r>
           </w:p>
         </w:tc>
@@ -4114,7 +4364,7 @@
                 <w:sz w:val="20"/>
                 <w:szCs w:val="20"/>
               </w:rPr>
-              <w:t xml:space="preserve">The component of the CRM Builder application that tracks implementation progress and presents the current step.</w:t>
+              <w:t xml:space="preserve">The primary view in Requirements mode. Displays the current phase and step, required inputs, available actions, and implementation progress.</w:t>
             </w:r>
           </w:p>
         </w:tc>
@@ -4332,7 +4582,7 @@
                 <w:sz w:val="20"/>
                 <w:szCs w:val="20"/>
               </w:rPr>
-              <w:t xml:space="preserve">Instance</w:t>
+              <w:t xml:space="preserve">Client</w:t>
             </w:r>
           </w:p>
         </w:tc>
@@ -4362,7 +4612,69 @@
                 <w:sz w:val="20"/>
                 <w:szCs w:val="20"/>
               </w:rPr>
-              <w:t xml:space="preserve">A configured CRM environment (server, credentials, project folder) managed by the CRM Builder application.</w:t>
+              <w:t xml:space="preserve">The organization receiving a CRM implementation. A client record links the organization to a project folder on the local filesystem.</w:t>
+            </w:r>
+          </w:p>
+        </w:tc>
+      </w:tr>
+      <w:tr>
+        <w:tc>
+          <w:tcPr>
+            <w:tcW w:type="dxa" w:w="2200"/>
+            <w:tcBorders>
+              <w:top w:val="single" w:color="AAAAAA" w:sz="4"/>
+              <w:left w:val="single" w:color="AAAAAA" w:sz="4"/>
+              <w:bottom w:val="single" w:color="AAAAAA" w:sz="4"/>
+              <w:right w:val="single" w:color="AAAAAA" w:sz="4"/>
+            </w:tcBorders>
+            <w:shd w:fill="F2F7FB" w:val="clear"/>
+            <w:tcMar>
+              <w:top w:type="dxa" w:w="80"/>
+              <w:left w:type="dxa" w:w="120"/>
+              <w:bottom w:type="dxa" w:w="80"/>
+              <w:right w:type="dxa" w:w="120"/>
+            </w:tcMar>
+          </w:tcPr>
+          <w:p>
+            <w:r>
+              <w:rPr>
+                <w:rFonts w:ascii="Arial" w:cs="Arial" w:eastAsia="Arial" w:hAnsi="Arial"/>
+                <w:b/>
+                <w:bCs/>
+                <w:sz w:val="20"/>
+                <w:szCs w:val="20"/>
+              </w:rPr>
+              <w:t xml:space="preserve">Instance</w:t>
+            </w:r>
+          </w:p>
+        </w:tc>
+        <w:tc>
+          <w:tcPr>
+            <w:tcW w:type="dxa" w:w="7160"/>
+            <w:tcBorders>
+              <w:top w:val="single" w:color="AAAAAA" w:sz="4"/>
+              <w:left w:val="single" w:color="AAAAAA" w:sz="4"/>
+              <w:bottom w:val="single" w:color="AAAAAA" w:sz="4"/>
+              <w:right w:val="single" w:color="AAAAAA" w:sz="4"/>
+            </w:tcBorders>
+            <w:shd w:fill="F2F7FB" w:val="clear"/>
+            <w:tcMar>
+              <w:top w:type="dxa" w:w="80"/>
+              <w:left w:type="dxa" w:w="120"/>
+              <w:bottom w:type="dxa" w:w="80"/>
+              <w:right w:type="dxa" w:w="120"/>
+            </w:tcMar>
+          </w:tcPr>
+          <w:p>
+            <w:r>
+              <w:rPr>
+                <w:rFonts w:ascii="Arial" w:cs="Arial" w:eastAsia="Arial" w:hAnsi="Arial"/>
+                <w:b w:val="false"/>
+                <w:bCs w:val="false"/>
+                <w:sz w:val="20"/>
+                <w:szCs w:val="20"/>
+              </w:rPr>
+              <w:t xml:space="preserve">A CRM environment connection (URL and credentials) managed by the CRM Builder application. An instance is linked to a client after CRM deployment.</w:t>
             </w:r>
           </w:p>
         </w:tc>
@@ -4471,7 +4783,7 @@
           <w:sz w:val="22"/>
           <w:szCs w:val="22"/>
         </w:rPr>
-        <w:t xml:space="preserve">Process Document — detailed specification of a single business process.</w:t>
+        <w:t xml:space="preserve">Cross-Domain Service Definition — specification of a shared capability (such as Notes, Email, Calendar, or Surveys) consumed by multiple domains.</w:t>
       </w:r>
     </w:p>
     <w:p>
@@ -4489,7 +4801,7 @@
           <w:sz w:val="22"/>
           <w:szCs w:val="22"/>
         </w:rPr>
-        <w:t xml:space="preserve">Domain PRD — consolidated requirements document for a domain, synthesized from process documents.</w:t>
+        <w:t xml:space="preserve">Process Document — detailed specification of a single business process.</w:t>
       </w:r>
     </w:p>
     <w:p>
@@ -4507,7 +4819,25 @@
           <w:sz w:val="22"/>
           <w:szCs w:val="22"/>
         </w:rPr>
-        <w:t xml:space="preserve">CRM Evaluation Report — the output of Phase 8, documenting the platform selection decision.</w:t>
+        <w:t xml:space="preserve">Domain PRD — consolidated requirements document for a domain, synthesized from process documents.</w:t>
+      </w:r>
+    </w:p>
+    <w:p>
+      <w:pPr>
+        <w:pStyle w:val="ListParagraph"/>
+        <w:numPr>
+          <w:ilvl w:val="0"/>
+          <w:numId w:val="2"/>
+        </w:numPr>
+        <w:spacing w:after="80"/>
+      </w:pPr>
+      <w:r>
+        <w:rPr>
+          <w:rFonts w:ascii="Arial" w:cs="Arial" w:eastAsia="Arial" w:hAnsi="Arial"/>
+          <w:sz w:val="22"/>
+          <w:szCs w:val="22"/>
+        </w:rPr>
+        <w:t xml:space="preserve">CRM Evaluation Report — the output of Phase 9, documenting the platform selection decision.</w:t>
       </w:r>
     </w:p>
     <w:p>

</xml_diff>

<commit_message>
User Guide v1.2: align with L2 PRD v1.16 tab restructure
- Mode references (Requirements mode/Deployment mode) updated to tab
  references (Requirements tab/Deployment tab/Clients tab)
- §4.2 Setting Up a Project updated for Clients tab workflow
- §4.3 breadcrumb example updated to Requirements Dashboard
- §4.8 Deploy panel reference updated to Deployment tab
- Glossary updated
</commit_message>
<xml_diff>
--- a/docs/CRM-Builder-User-Guide.docx
+++ b/docs/CRM-Builder-User-Guide.docx
@@ -57,7 +57,7 @@
           <w:sz w:val="22"/>
           <w:szCs w:val="22"/>
         </w:rPr>
-        <w:t xml:space="preserve">Last Updated: 04-10-26 00:58</w:t>
+        <w:t xml:space="preserve">Last Updated: 04-10-26 15:00</w:t>
       </w:r>
     </w:p>
     <w:p>
@@ -2888,7 +2888,7 @@
           <w:sz w:val="22"/>
           <w:szCs w:val="22"/>
         </w:rPr>
-        <w:t xml:space="preserve">Open CRM Builder in Requirements mode.</w:t>
+        <w:t xml:space="preserve">Open CRM Builder and navigate to the Clients tab.</w:t>
       </w:r>
     </w:p>
     <w:p>
@@ -2906,7 +2906,7 @@
           <w:sz w:val="22"/>
           <w:szCs w:val="22"/>
         </w:rPr>
-        <w:t xml:space="preserve">Click Create Client and provide the client name.</w:t>
+        <w:t xml:space="preserve">Click “+ New Client” and provide the client name and code.</w:t>
       </w:r>
     </w:p>
     <w:p>
@@ -2960,7 +2960,7 @@
           <w:sz w:val="22"/>
           <w:szCs w:val="22"/>
         </w:rPr>
-        <w:t xml:space="preserve">The Requirements Dashboard activates at Phase 1 — Master PRD. Proceed to Section 4.3 to begin the workflow.</w:t>
+        <w:t xml:space="preserve">Switch to the Requirements tab. The Requirements Dashboard activates at Phase 1 — Master PRD. Proceed to Section 4.3 to begin the workflow.</w:t>
       </w:r>
     </w:p>
     <w:p>
@@ -2994,7 +2994,7 @@
           <w:sz w:val="22"/>
           <w:szCs w:val="22"/>
         </w:rPr>
-        <w:t xml:space="preserve">The Requirements Dashboard is the default view in Requirements mode and the implementor’s primary workspace. It answers two questions: what should I work on next, and how is the project progressing overall?</w:t>
+        <w:t xml:space="preserve">The Requirements Dashboard is the default view in the Requirements tab and the implementor’s primary workspace. It answers two questions: what should I work on next, and how is the project progressing overall?</w:t>
       </w:r>
     </w:p>
     <w:p>
@@ -3214,7 +3214,7 @@
           <w:sz w:val="22"/>
           <w:szCs w:val="22"/>
         </w:rPr>
-        <w:t xml:space="preserve"> — Clicking any work item row opens the Work Item Detail view. A breadcrumb at the top updates to show the navigation path (for example, “Dashboard › Mentor Onboarding (MR-ONBOARD)”).</w:t>
+        <w:t xml:space="preserve"> — Clicking any work item row opens the Work Item Detail view. A breadcrumb at the top updates to show the navigation path (for example, “Requirements Dashboard › Mentor Onboarding (MR-ONBOARD)”).</w:t>
       </w:r>
     </w:p>
     <w:p>
@@ -3742,7 +3742,7 @@
           <w:sz w:val="22"/>
           <w:szCs w:val="22"/>
         </w:rPr>
-        <w:t xml:space="preserve">In Phase 10, the implementor provisions a new CRM instance using the Deploy panel. The Deploy Wizard guides the implementor through server setup, including domain configuration and SSL certificate issuance.</w:t>
+        <w:t xml:space="preserve">In Phase 10, the implementor provisions a new CRM instance using the Deployment tab. The Deploy Wizard guides the implementor through server setup, including domain configuration and SSL certificate issuance.</w:t>
       </w:r>
     </w:p>
     <w:p>
@@ -4364,7 +4364,7 @@
                 <w:sz w:val="20"/>
                 <w:szCs w:val="20"/>
               </w:rPr>
-              <w:t xml:space="preserve">The primary view in Requirements mode. Displays the current phase and step, required inputs, available actions, and implementation progress.</w:t>
+              <w:t xml:space="preserve">The primary view in the Requirements tab. Displays the current phase and step, required inputs, available actions, and implementation progress.</w:t>
             </w:r>
           </w:p>
         </w:tc>

</xml_diff>